<commit_message>
feat: perbarui jadwal & tarif mengikuti poster 25 September 2026
</commit_message>
<xml_diff>
--- a/docs/Profil-Gow-Tennis.docx
+++ b/docs/Profil-Gow-Tennis.docx
@@ -195,7 +195,7 @@
                 <w:color w:val="0D2145"/>
                 <w:sz w:val="34"/>
               </w:rPr>
-              <w:t>3</w:t>
+              <w:t>4</w:t>
             </w:r>
           </w:p>
         </w:tc>
@@ -300,7 +300,7 @@
           <w:color w:val="64748B"/>
           <w:sz w:val="16"/>
         </w:rPr>
-        <w:t>Profil Komunitas  ·  Data per 2026-09-19</w:t>
+        <w:t>Profil Komunitas  ·  Data per 2026-09-25</w:t>
       </w:r>
     </w:p>
     <w:p>
@@ -350,7 +350,7 @@
           <w:color w:val="0B1B36"/>
           <w:sz w:val="19"/>
         </w:rPr>
-        <w:t>Gow! Tennis adalah komunitas tenis asal Bandung yang dibangun di sekitar satu ide sederhana: tenis tidak harus menegangkan untuk jadi serius. Taglinenya, "Kadang Melesat, Kadang Meleset", dipakai apa adanya sebagai izin untuk gagal di lapangan dan tetap kembali minggu depan. Aktivitasnya berputar pada dua hal, coaching session terstruktur untuk pemula sampai upper beginner, dan fun match sebagai ruang bermain tanpa beban. Sesi digelar di lapangan indoor kampus Universitas Pendidikan Indonesia dan lapangan outdoor Pusdikku, dengan paket yang sudah mencakup bola, ballboy, dan raket pinjaman bagi yang belum punya, sehingga pendatang baru bisa ikut tanpa modal peralatan lebih dulu. Kanal Instagram dan TikTok-nya dipakai bukan sekadar etalase, melainkan pintu masuk: pendaftaran berjalan lewat DM, jadwal diumumkan lewat feed, dan konten hariannya mencampur dokumentasi latihan dengan humor khas komunitas.</w:t>
+        <w:t>Gow! Tennis adalah komunitas tenis asal Bandung yang dibangun di sekitar satu ide sederhana: tenis tidak harus menegangkan untuk jadi serius. Taglinenya, "Kadang Melesat, Kadang Meleset", dipakai apa adanya sebagai izin untuk gagal di lapangan dan tetap kembali minggu depan. Jadwalnya berjalan tetap setiap pekan, dari kelas Semi-Intense pada Senin pagi, Coaching Beginner pada Selasa sore, sampai Fun Games pada Sabtu sore, ditambah kelas Private yang diatur sesuai janji temu. Rentang biayanya lebar dan disengaja: Rp50.000 untuk kelas pemula berkuota sepuluh orang, naik sampai kelas privat satu lawan satu, sehingga orang bisa masuk dari titik mana pun sesuai kesiapan. Sebagian besar kelas sudah mencakup raket, bola, dan ballboy, jadi pendatang baru tidak perlu modal peralatan lebih dulu. Sesi tersebar di beberapa lapangan di Bandung, dari lapangan indoor dan outdoor kampus Universitas Pendidikan Indonesia sampai lapangan PRV, Abadi, dan Secapa. Kanal Instagram dan TikTok-nya dipakai bukan sekadar etalase, melainkan pintu masuk: pendaftaran berjalan lewat grup WhatsApp dan DM, jadwal diumumkan lewat feed, dan konten hariannya mencampur dokumentasi latihan dengan humor khas komunitas.</w:t>
       </w:r>
     </w:p>
     <w:p>
@@ -390,7 +390,7 @@
           <w:color w:val="0B1B36"/>
           <w:sz w:val="19"/>
         </w:rPr>
-        <w:t>Kelas dirancang dari titik nol. Raket, bola, dan ballboy sudah termasuk, jadi yang belum punya alat tetap bisa ikut sesi pertama.</w:t>
+        <w:t>Kelas dirancang dari titik nol. Raket, bola, dan ballboy sudah termasuk di kelas reguler, jadi yang belum punya alat tetap bisa ikut sesi pertama.</w:t>
       </w:r>
     </w:p>
     <w:p>
@@ -415,7 +415,7 @@
           <w:color w:val="0B1B36"/>
           <w:sz w:val="19"/>
         </w:rPr>
-        <w:t>Ada pelatih dan progresi kelas beginner ke upper beginner, tapi tanpa tekanan kompetisi yang bikin orang berhenti di minggu kedua.</w:t>
+        <w:t>Ada progresi nyata dari Coaching Beginner ke Semi-Intense sampai kelas privat, tapi tanpa tekanan kompetisi yang bikin orang berhenti di minggu kedua.</w:t>
       </w:r>
     </w:p>
     <w:p>
@@ -465,7 +465,7 @@
           <w:color w:val="0B1B36"/>
           <w:sz w:val="19"/>
         </w:rPr>
-        <w:t>Pendaftaran cukup lewat DM Instagram atau WhatsApp admin. Tidak ada keanggotaan berjenjang atau biaya gabung di muka.</w:t>
+        <w:t>Jadwal tetap tiap pekan dan biaya mulai Rp50.000. Pendaftaran cukup lewat grup WhatsApp atau DM, tanpa keanggotaan berjenjang atau biaya gabung di muka.</w:t>
       </w:r>
     </w:p>
     <w:p>
@@ -713,7 +713,7 @@
                 <w:color w:val="0B1B36"/>
                 <w:sz w:val="17"/>
               </w:rPr>
-              <w:t>Coaching Session, Tennis Malam Minggu, Fun Match</w:t>
+              <w:t>Semi-Intense, Coaching Beginner, Fun Games, Private</w:t>
             </w:r>
           </w:p>
         </w:tc>
@@ -763,7 +763,7 @@
                 <w:color w:val="0B1B36"/>
                 <w:sz w:val="17"/>
               </w:rPr>
-              <w:t>Lapangan Indoor UPI, Lapangan Outdoor Pusdikku</w:t>
+              <w:t>5 lokasi: Indoor UPI, Outdoor UPI, Tennis PRV, Abadi, Secapa</w:t>
             </w:r>
           </w:p>
         </w:tc>
@@ -813,7 +813,7 @@
                 <w:color w:val="0B1B36"/>
                 <w:sz w:val="17"/>
               </w:rPr>
-              <w:t>Rp85.000 per orang</w:t>
+              <w:t>Rp50.000 per orang</w:t>
             </w:r>
           </w:p>
         </w:tc>
@@ -1017,16 +1017,17 @@
           <w:color w:val="0B1B36"/>
           <w:sz w:val="19"/>
         </w:rPr>
-        <w:t>Seluruh program terbuka untuk pemain pemula. Perlengkapan dasar sudah termasuk dalam biaya, sehingga peserta baru tidak perlu membeli raket sebelum mencoba.</w:t>
+        <w:t>Jadwal berjalan tetap setiap pekan. Kelas Senin dan Selasa di UPI sudah mencakup raket, bola, dan ballboy, sehingga peserta baru tidak perlu membeli perlengkapan sebelum mencoba. Untuk kelas privat, biaya coaching dan sewa lapangan dihitung terpisah.</w:t>
       </w:r>
     </w:p>
     <w:tbl>
       <w:tblGrid>
-        <w:gridCol w:w="1928"/>
-        <w:gridCol w:w="1638"/>
+        <w:gridCol w:w="1831"/>
+        <w:gridCol w:w="964"/>
+        <w:gridCol w:w="1542"/>
         <w:gridCol w:w="2024"/>
-        <w:gridCol w:w="2313"/>
-        <w:gridCol w:w="1735"/>
+        <w:gridCol w:w="1253"/>
+        <w:gridCol w:w="2024"/>
       </w:tblGrid>
       <w:tblPr>
         <w:tblW w:type="auto" w:w="0"/>
@@ -1037,7 +1038,7 @@
       <w:tr>
         <w:tc>
           <w:tcPr>
-            <w:tcW w:type="dxa" w:w="1928"/>
+            <w:tcW w:type="dxa" w:w="1831"/>
             <w:shd w:val="clear" w:color="auto" w:fill="0D2145"/>
           </w:tcPr>
           <w:p>
@@ -1058,7 +1059,7 @@
         </w:tc>
         <w:tc>
           <w:tcPr>
-            <w:tcW w:type="dxa" w:w="1638"/>
+            <w:tcW w:type="dxa" w:w="964"/>
             <w:shd w:val="clear" w:color="auto" w:fill="0D2145"/>
           </w:tcPr>
           <w:p>
@@ -1073,7 +1074,28 @@
                 <w:color w:val="FFFFFF"/>
                 <w:sz w:val="16"/>
               </w:rPr>
-              <w:t>Level</w:t>
+              <w:t>Hari</w:t>
+            </w:r>
+          </w:p>
+        </w:tc>
+        <w:tc>
+          <w:tcPr>
+            <w:tcW w:type="dxa" w:w="1542"/>
+            <w:shd w:val="clear" w:color="auto" w:fill="0D2145"/>
+          </w:tcPr>
+          <w:p>
+            <w:pPr>
+              <w:spacing w:after="0"/>
+            </w:pPr>
+            <w:r>
+              <w:rPr>
+                <w:rFonts w:ascii="Arial" w:hAnsi="Arial"/>
+                <w:b/>
+                <w:i w:val="0"/>
+                <w:color w:val="FFFFFF"/>
+                <w:sz w:val="16"/>
+              </w:rPr>
+              <w:t>Jam</w:t>
             </w:r>
           </w:p>
         </w:tc>
@@ -1094,13 +1116,13 @@
                 <w:color w:val="FFFFFF"/>
                 <w:sz w:val="16"/>
               </w:rPr>
-              <w:t>Jadwal / Durasi</w:t>
+              <w:t>Lokasi</w:t>
             </w:r>
           </w:p>
         </w:tc>
         <w:tc>
           <w:tcPr>
-            <w:tcW w:type="dxa" w:w="2313"/>
+            <w:tcW w:type="dxa" w:w="1253"/>
             <w:shd w:val="clear" w:color="auto" w:fill="0D2145"/>
           </w:tcPr>
           <w:p>
@@ -1115,13 +1137,13 @@
                 <w:color w:val="FFFFFF"/>
                 <w:sz w:val="16"/>
               </w:rPr>
-              <w:t>Lokasi</w:t>
+              <w:t>Kuota</w:t>
             </w:r>
           </w:p>
         </w:tc>
         <w:tc>
           <w:tcPr>
-            <w:tcW w:type="dxa" w:w="1735"/>
+            <w:tcW w:type="dxa" w:w="2024"/>
             <w:shd w:val="clear" w:color="auto" w:fill="0D2145"/>
           </w:tcPr>
           <w:p>
@@ -1144,7 +1166,7 @@
       <w:tr>
         <w:tc>
           <w:tcPr>
-            <w:tcW w:type="dxa" w:w="1928"/>
+            <w:tcW w:type="dxa" w:w="1831"/>
             <w:tcBorders>
               <w:bottom w:val="single" w:sz="4" w:color="E2E8F0"/>
             </w:tcBorders>
@@ -1161,13 +1183,13 @@
                 <w:color w:val="0D2145"/>
                 <w:sz w:val="17"/>
               </w:rPr>
-              <w:t>Coaching Session</w:t>
+              <w:t>Semi-Intense</w:t>
             </w:r>
           </w:p>
         </w:tc>
         <w:tc>
           <w:tcPr>
-            <w:tcW w:type="dxa" w:w="1638"/>
+            <w:tcW w:type="dxa" w:w="964"/>
             <w:tcBorders>
               <w:bottom w:val="single" w:sz="4" w:color="E2E8F0"/>
             </w:tcBorders>
@@ -1184,7 +1206,30 @@
                 <w:color w:val="0B1B36"/>
                 <w:sz w:val="17"/>
               </w:rPr>
-              <w:t>Beginner - Upper Beginner</w:t>
+              <w:t>Senin</w:t>
+            </w:r>
+          </w:p>
+        </w:tc>
+        <w:tc>
+          <w:tcPr>
+            <w:tcW w:type="dxa" w:w="1542"/>
+            <w:tcBorders>
+              <w:bottom w:val="single" w:sz="4" w:color="E2E8F0"/>
+            </w:tcBorders>
+          </w:tcPr>
+          <w:p>
+            <w:pPr>
+              <w:spacing w:after="0"/>
+            </w:pPr>
+            <w:r>
+              <w:rPr>
+                <w:rFonts w:ascii="Arial" w:hAnsi="Arial"/>
+                <w:b w:val="0"/>
+                <w:i w:val="0"/>
+                <w:color w:val="0B1B36"/>
+                <w:sz w:val="17"/>
+              </w:rPr>
+              <w:t>08.00 - 10.00 WIB</w:t>
             </w:r>
           </w:p>
         </w:tc>
@@ -1207,13 +1252,13 @@
                 <w:color w:val="0B1B36"/>
                 <w:sz w:val="17"/>
               </w:rPr>
-              <w:t>2 jam (6 orang per sesi)</w:t>
+              <w:t>Lapangan Indoor UPI</w:t>
             </w:r>
           </w:p>
         </w:tc>
         <w:tc>
           <w:tcPr>
-            <w:tcW w:type="dxa" w:w="2313"/>
+            <w:tcW w:type="dxa" w:w="1253"/>
             <w:tcBorders>
               <w:bottom w:val="single" w:sz="4" w:color="E2E8F0"/>
             </w:tcBorders>
@@ -1230,13 +1275,13 @@
                 <w:color w:val="0B1B36"/>
                 <w:sz w:val="17"/>
               </w:rPr>
-              <w:t>Lapangan indoor Universitas Pendidikan Indonesia (UPI)</w:t>
+              <w:t>7 orang</w:t>
             </w:r>
           </w:p>
         </w:tc>
         <w:tc>
           <w:tcPr>
-            <w:tcW w:type="dxa" w:w="1735"/>
+            <w:tcW w:type="dxa" w:w="2024"/>
             <w:tcBorders>
               <w:bottom w:val="single" w:sz="4" w:color="E2E8F0"/>
             </w:tcBorders>
@@ -1253,7 +1298,7 @@
                 <w:color w:val="0B1B36"/>
                 <w:sz w:val="17"/>
               </w:rPr>
-              <w:t>Rp85.000 per orang</w:t>
+              <w:t>Rp105.000 per orang</w:t>
             </w:r>
           </w:p>
         </w:tc>
@@ -1261,7 +1306,7 @@
       <w:tr>
         <w:tc>
           <w:tcPr>
-            <w:tcW w:type="dxa" w:w="1928"/>
+            <w:tcW w:type="dxa" w:w="1831"/>
             <w:shd w:val="clear" w:color="auto" w:fill="F4F6FA"/>
             <w:tcBorders>
               <w:bottom w:val="single" w:sz="4" w:color="E2E8F0"/>
@@ -1279,13 +1324,13 @@
                 <w:color w:val="0D2145"/>
                 <w:sz w:val="17"/>
               </w:rPr>
-              <w:t>Tennis Malam Minggu</w:t>
+              <w:t>Coaching Beginner</w:t>
             </w:r>
           </w:p>
         </w:tc>
         <w:tc>
           <w:tcPr>
-            <w:tcW w:type="dxa" w:w="1638"/>
+            <w:tcW w:type="dxa" w:w="964"/>
             <w:shd w:val="clear" w:color="auto" w:fill="F4F6FA"/>
             <w:tcBorders>
               <w:bottom w:val="single" w:sz="4" w:color="E2E8F0"/>
@@ -1303,7 +1348,31 @@
                 <w:color w:val="0B1B36"/>
                 <w:sz w:val="17"/>
               </w:rPr>
-              <w:t>Beginner - Upper Beginner</w:t>
+              <w:t>Selasa</w:t>
+            </w:r>
+          </w:p>
+        </w:tc>
+        <w:tc>
+          <w:tcPr>
+            <w:tcW w:type="dxa" w:w="1542"/>
+            <w:shd w:val="clear" w:color="auto" w:fill="F4F6FA"/>
+            <w:tcBorders>
+              <w:bottom w:val="single" w:sz="4" w:color="E2E8F0"/>
+            </w:tcBorders>
+          </w:tcPr>
+          <w:p>
+            <w:pPr>
+              <w:spacing w:after="0"/>
+            </w:pPr>
+            <w:r>
+              <w:rPr>
+                <w:rFonts w:ascii="Arial" w:hAnsi="Arial"/>
+                <w:b w:val="0"/>
+                <w:i w:val="0"/>
+                <w:color w:val="0B1B36"/>
+                <w:sz w:val="17"/>
+              </w:rPr>
+              <w:t>16.00 - 18.00 WIB</w:t>
             </w:r>
           </w:p>
         </w:tc>
@@ -1327,13 +1396,13 @@
                 <w:color w:val="0B1B36"/>
                 <w:sz w:val="17"/>
               </w:rPr>
-              <w:t>Sabtu, 18.00 - 20.00 WIB</w:t>
+              <w:t>Lapangan Outdoor UPI</w:t>
             </w:r>
           </w:p>
         </w:tc>
         <w:tc>
           <w:tcPr>
-            <w:tcW w:type="dxa" w:w="2313"/>
+            <w:tcW w:type="dxa" w:w="1253"/>
             <w:shd w:val="clear" w:color="auto" w:fill="F4F6FA"/>
             <w:tcBorders>
               <w:bottom w:val="single" w:sz="4" w:color="E2E8F0"/>
@@ -1351,13 +1420,13 @@
                 <w:color w:val="0B1B36"/>
                 <w:sz w:val="17"/>
               </w:rPr>
-              <w:t>Lapangan outdoor Pusdikku, Bandung</w:t>
+              <w:t>10 orang</w:t>
             </w:r>
           </w:p>
         </w:tc>
         <w:tc>
           <w:tcPr>
-            <w:tcW w:type="dxa" w:w="1735"/>
+            <w:tcW w:type="dxa" w:w="2024"/>
             <w:shd w:val="clear" w:color="auto" w:fill="F4F6FA"/>
             <w:tcBorders>
               <w:bottom w:val="single" w:sz="4" w:color="E2E8F0"/>
@@ -1375,7 +1444,7 @@
                 <w:color w:val="0B1B36"/>
                 <w:sz w:val="17"/>
               </w:rPr>
-              <w:t>Rp115.000 (HTM)</w:t>
+              <w:t>Rp50.000 per orang</w:t>
             </w:r>
           </w:p>
         </w:tc>
@@ -1383,7 +1452,7 @@
       <w:tr>
         <w:tc>
           <w:tcPr>
-            <w:tcW w:type="dxa" w:w="1928"/>
+            <w:tcW w:type="dxa" w:w="1831"/>
             <w:tcBorders>
               <w:bottom w:val="single" w:sz="4" w:color="E2E8F0"/>
             </w:tcBorders>
@@ -1400,13 +1469,13 @@
                 <w:color w:val="0D2145"/>
                 <w:sz w:val="17"/>
               </w:rPr>
-              <w:t>Fun Match</w:t>
+              <w:t>Fun Games</w:t>
             </w:r>
           </w:p>
         </w:tc>
         <w:tc>
           <w:tcPr>
-            <w:tcW w:type="dxa" w:w="1638"/>
+            <w:tcW w:type="dxa" w:w="964"/>
             <w:tcBorders>
               <w:bottom w:val="single" w:sz="4" w:color="E2E8F0"/>
             </w:tcBorders>
@@ -1423,7 +1492,30 @@
                 <w:color w:val="0B1B36"/>
                 <w:sz w:val="17"/>
               </w:rPr>
-              <w:t>Terbuka</w:t>
+              <w:t>Sabtu</w:t>
+            </w:r>
+          </w:p>
+        </w:tc>
+        <w:tc>
+          <w:tcPr>
+            <w:tcW w:type="dxa" w:w="1542"/>
+            <w:tcBorders>
+              <w:bottom w:val="single" w:sz="4" w:color="E2E8F0"/>
+            </w:tcBorders>
+          </w:tcPr>
+          <w:p>
+            <w:pPr>
+              <w:spacing w:after="0"/>
+            </w:pPr>
+            <w:r>
+              <w:rPr>
+                <w:rFonts w:ascii="Arial" w:hAnsi="Arial"/>
+                <w:b w:val="0"/>
+                <w:i w:val="0"/>
+                <w:color w:val="0B1B36"/>
+                <w:sz w:val="17"/>
+              </w:rPr>
+              <w:t>16.00 - 18.00 WIB</w:t>
             </w:r>
           </w:p>
         </w:tc>
@@ -1446,13 +1538,13 @@
                 <w:color w:val="0B1B36"/>
                 <w:sz w:val="17"/>
               </w:rPr>
-              <w:t>—</w:t>
+              <w:t>Lapangan Tennis PRV</w:t>
             </w:r>
           </w:p>
         </w:tc>
         <w:tc>
           <w:tcPr>
-            <w:tcW w:type="dxa" w:w="2313"/>
+            <w:tcW w:type="dxa" w:w="1253"/>
             <w:tcBorders>
               <w:bottom w:val="single" w:sz="4" w:color="E2E8F0"/>
             </w:tcBorders>
@@ -1469,13 +1561,13 @@
                 <w:color w:val="0B1B36"/>
                 <w:sz w:val="17"/>
               </w:rPr>
-              <w:t>Menyesuaikan jadwal komunitas</w:t>
+              <w:t>—</w:t>
             </w:r>
           </w:p>
         </w:tc>
         <w:tc>
           <w:tcPr>
-            <w:tcW w:type="dxa" w:w="1735"/>
+            <w:tcW w:type="dxa" w:w="2024"/>
             <w:tcBorders>
               <w:bottom w:val="single" w:sz="4" w:color="E2E8F0"/>
             </w:tcBorders>
@@ -1492,7 +1584,153 @@
                 <w:color w:val="0B1B36"/>
                 <w:sz w:val="17"/>
               </w:rPr>
-              <w:t>Diumumkan per agenda</w:t>
+              <w:t>Rp55.000 per orang</w:t>
+            </w:r>
+          </w:p>
+        </w:tc>
+      </w:tr>
+      <w:tr>
+        <w:tc>
+          <w:tcPr>
+            <w:tcW w:type="dxa" w:w="1831"/>
+            <w:shd w:val="clear" w:color="auto" w:fill="F4F6FA"/>
+            <w:tcBorders>
+              <w:bottom w:val="single" w:sz="4" w:color="E2E8F0"/>
+            </w:tcBorders>
+          </w:tcPr>
+          <w:p>
+            <w:pPr>
+              <w:spacing w:after="0"/>
+            </w:pPr>
+            <w:r>
+              <w:rPr>
+                <w:rFonts w:ascii="Arial" w:hAnsi="Arial"/>
+                <w:b/>
+                <w:i w:val="0"/>
+                <w:color w:val="0D2145"/>
+                <w:sz w:val="17"/>
+              </w:rPr>
+              <w:t>Private</w:t>
+            </w:r>
+          </w:p>
+        </w:tc>
+        <w:tc>
+          <w:tcPr>
+            <w:tcW w:type="dxa" w:w="964"/>
+            <w:shd w:val="clear" w:color="auto" w:fill="F4F6FA"/>
+            <w:tcBorders>
+              <w:bottom w:val="single" w:sz="4" w:color="E2E8F0"/>
+            </w:tcBorders>
+          </w:tcPr>
+          <w:p>
+            <w:pPr>
+              <w:spacing w:after="0"/>
+            </w:pPr>
+            <w:r>
+              <w:rPr>
+                <w:rFonts w:ascii="Arial" w:hAnsi="Arial"/>
+                <w:b w:val="0"/>
+                <w:i w:val="0"/>
+                <w:color w:val="0B1B36"/>
+                <w:sz w:val="17"/>
+              </w:rPr>
+              <w:t>Sabtu</w:t>
+            </w:r>
+          </w:p>
+        </w:tc>
+        <w:tc>
+          <w:tcPr>
+            <w:tcW w:type="dxa" w:w="1542"/>
+            <w:shd w:val="clear" w:color="auto" w:fill="F4F6FA"/>
+            <w:tcBorders>
+              <w:bottom w:val="single" w:sz="4" w:color="E2E8F0"/>
+            </w:tcBorders>
+          </w:tcPr>
+          <w:p>
+            <w:pPr>
+              <w:spacing w:after="0"/>
+            </w:pPr>
+            <w:r>
+              <w:rPr>
+                <w:rFonts w:ascii="Arial" w:hAnsi="Arial"/>
+                <w:b w:val="0"/>
+                <w:i w:val="0"/>
+                <w:color w:val="0B1B36"/>
+                <w:sz w:val="17"/>
+              </w:rPr>
+              <w:t>by appointment</w:t>
+            </w:r>
+          </w:p>
+        </w:tc>
+        <w:tc>
+          <w:tcPr>
+            <w:tcW w:type="dxa" w:w="2024"/>
+            <w:shd w:val="clear" w:color="auto" w:fill="F4F6FA"/>
+            <w:tcBorders>
+              <w:bottom w:val="single" w:sz="4" w:color="E2E8F0"/>
+            </w:tcBorders>
+          </w:tcPr>
+          <w:p>
+            <w:pPr>
+              <w:spacing w:after="0"/>
+            </w:pPr>
+            <w:r>
+              <w:rPr>
+                <w:rFonts w:ascii="Arial" w:hAnsi="Arial"/>
+                <w:b w:val="0"/>
+                <w:i w:val="0"/>
+                <w:color w:val="0B1B36"/>
+                <w:sz w:val="17"/>
+              </w:rPr>
+              <w:t>Lapangan Abadi atau Secapa</w:t>
+            </w:r>
+          </w:p>
+        </w:tc>
+        <w:tc>
+          <w:tcPr>
+            <w:tcW w:type="dxa" w:w="1253"/>
+            <w:shd w:val="clear" w:color="auto" w:fill="F4F6FA"/>
+            <w:tcBorders>
+              <w:bottom w:val="single" w:sz="4" w:color="E2E8F0"/>
+            </w:tcBorders>
+          </w:tcPr>
+          <w:p>
+            <w:pPr>
+              <w:spacing w:after="0"/>
+            </w:pPr>
+            <w:r>
+              <w:rPr>
+                <w:rFonts w:ascii="Arial" w:hAnsi="Arial"/>
+                <w:b w:val="0"/>
+                <w:i w:val="0"/>
+                <w:color w:val="0B1B36"/>
+                <w:sz w:val="17"/>
+              </w:rPr>
+              <w:t>Perorangan</w:t>
+            </w:r>
+          </w:p>
+        </w:tc>
+        <w:tc>
+          <w:tcPr>
+            <w:tcW w:type="dxa" w:w="2024"/>
+            <w:shd w:val="clear" w:color="auto" w:fill="F4F6FA"/>
+            <w:tcBorders>
+              <w:bottom w:val="single" w:sz="4" w:color="E2E8F0"/>
+            </w:tcBorders>
+          </w:tcPr>
+          <w:p>
+            <w:pPr>
+              <w:spacing w:after="0"/>
+            </w:pPr>
+            <w:r>
+              <w:rPr>
+                <w:rFonts w:ascii="Arial" w:hAnsi="Arial"/>
+                <w:b w:val="0"/>
+                <w:i w:val="0"/>
+                <w:color w:val="0B1B36"/>
+                <w:sz w:val="17"/>
+              </w:rPr>
+              <w:t>Rp165.000 per jam</w:t>
             </w:r>
           </w:p>
         </w:tc>
@@ -1515,8 +1753,8 @@
     </w:p>
     <w:tbl>
       <w:tblGrid>
-        <w:gridCol w:w="2120"/>
-        <w:gridCol w:w="7517"/>
+        <w:gridCol w:w="2313"/>
+        <w:gridCol w:w="7325"/>
       </w:tblGrid>
       <w:tblPr>
         <w:tblW w:type="auto" w:w="0"/>
@@ -1527,7 +1765,7 @@
       <w:tr>
         <w:tc>
           <w:tcPr>
-            <w:tcW w:type="dxa" w:w="7517"/>
+            <w:tcW w:type="dxa" w:w="7325"/>
             <w:gridSpan w:val="2"/>
             <w:shd w:val="clear" w:color="auto" w:fill="0D2145"/>
           </w:tcPr>
@@ -1543,7 +1781,7 @@
                 <w:color w:val="FFFFFF"/>
                 <w:sz w:val="16"/>
               </w:rPr>
-              <w:t>COACHING SESSION</w:t>
+              <w:t>SEMI-INTENSE</w:t>
             </w:r>
           </w:p>
         </w:tc>
@@ -1551,7 +1789,7 @@
       <w:tr>
         <w:tc>
           <w:tcPr>
-            <w:tcW w:type="dxa" w:w="2120"/>
+            <w:tcW w:type="dxa" w:w="2313"/>
             <w:shd w:val="clear" w:color="auto" w:fill="F4F6FA"/>
             <w:tcBorders>
               <w:bottom w:val="single" w:sz="6" w:color="FFFFFF"/>
@@ -1575,7 +1813,7 @@
         </w:tc>
         <w:tc>
           <w:tcPr>
-            <w:tcW w:type="dxa" w:w="7517"/>
+            <w:tcW w:type="dxa" w:w="7325"/>
             <w:shd w:val="clear" w:color="auto" w:fill="F4F6FA"/>
             <w:tcBorders>
               <w:bottom w:val="single" w:sz="6" w:color="FFFFFF"/>
@@ -1593,7 +1831,7 @@
                 <w:color w:val="0B1B36"/>
                 <w:sz w:val="17"/>
               </w:rPr>
-              <w:t>Bola, Ballboy, Raket pinjaman (request lewat admin)</w:t>
+              <w:t>Raket, Ballboy, Bola, FG</w:t>
             </w:r>
           </w:p>
         </w:tc>
@@ -1601,7 +1839,7 @@
       <w:tr>
         <w:tc>
           <w:tcPr>
-            <w:tcW w:type="dxa" w:w="2120"/>
+            <w:tcW w:type="dxa" w:w="2313"/>
             <w:shd w:val="clear" w:color="auto" w:fill="F4F6FA"/>
             <w:tcBorders>
               <w:bottom w:val="single" w:sz="6" w:color="FFFFFF"/>
@@ -1625,7 +1863,7 @@
         </w:tc>
         <w:tc>
           <w:tcPr>
-            <w:tcW w:type="dxa" w:w="7517"/>
+            <w:tcW w:type="dxa" w:w="7325"/>
             <w:shd w:val="clear" w:color="auto" w:fill="F4F6FA"/>
             <w:tcBorders>
               <w:bottom w:val="single" w:sz="6" w:color="FFFFFF"/>
@@ -1643,7 +1881,7 @@
                 <w:color w:val="0B1B36"/>
                 <w:sz w:val="17"/>
               </w:rPr>
-              <w:t>Paket kelas reguler untuk pemula. Sumber: caption video TikTok @gowtennis.</w:t>
+              <w:t>Kelas dengan porsi latihan lebih padat. Sumber: poster jadwal 25 September 2026.</w:t>
             </w:r>
           </w:p>
         </w:tc>
@@ -1657,8 +1895,8 @@
     </w:p>
     <w:tbl>
       <w:tblGrid>
-        <w:gridCol w:w="2120"/>
-        <w:gridCol w:w="7517"/>
+        <w:gridCol w:w="2313"/>
+        <w:gridCol w:w="7325"/>
       </w:tblGrid>
       <w:tblPr>
         <w:tblW w:type="auto" w:w="0"/>
@@ -1669,7 +1907,7 @@
       <w:tr>
         <w:tc>
           <w:tcPr>
-            <w:tcW w:type="dxa" w:w="7517"/>
+            <w:tcW w:type="dxa" w:w="7325"/>
             <w:gridSpan w:val="2"/>
             <w:shd w:val="clear" w:color="auto" w:fill="0D2145"/>
           </w:tcPr>
@@ -1685,7 +1923,7 @@
                 <w:color w:val="FFFFFF"/>
                 <w:sz w:val="16"/>
               </w:rPr>
-              <w:t>TENNIS MALAM MINGGU</w:t>
+              <w:t>COACHING BEGINNER</w:t>
             </w:r>
           </w:p>
         </w:tc>
@@ -1693,7 +1931,7 @@
       <w:tr>
         <w:tc>
           <w:tcPr>
-            <w:tcW w:type="dxa" w:w="2120"/>
+            <w:tcW w:type="dxa" w:w="2313"/>
             <w:shd w:val="clear" w:color="auto" w:fill="F4F6FA"/>
             <w:tcBorders>
               <w:bottom w:val="single" w:sz="6" w:color="FFFFFF"/>
@@ -1717,7 +1955,7 @@
         </w:tc>
         <w:tc>
           <w:tcPr>
-            <w:tcW w:type="dxa" w:w="7517"/>
+            <w:tcW w:type="dxa" w:w="7325"/>
             <w:shd w:val="clear" w:color="auto" w:fill="F4F6FA"/>
             <w:tcBorders>
               <w:bottom w:val="single" w:sz="6" w:color="FFFFFF"/>
@@ -1735,7 +1973,7 @@
                 <w:color w:val="0B1B36"/>
                 <w:sz w:val="17"/>
               </w:rPr>
-              <w:t>Kelas bersama Coach Iwan, Free air kelapa</w:t>
+              <w:t>Raket, Ballboy, Bola, FG</w:t>
             </w:r>
           </w:p>
         </w:tc>
@@ -1743,57 +1981,7 @@
       <w:tr>
         <w:tc>
           <w:tcPr>
-            <w:tcW w:type="dxa" w:w="2120"/>
-            <w:shd w:val="clear" w:color="auto" w:fill="F4F6FA"/>
-            <w:tcBorders>
-              <w:bottom w:val="single" w:sz="6" w:color="FFFFFF"/>
-            </w:tcBorders>
-          </w:tcPr>
-          <w:p>
-            <w:pPr>
-              <w:spacing w:after="0"/>
-            </w:pPr>
-            <w:r>
-              <w:rPr>
-                <w:rFonts w:ascii="Arial" w:hAnsi="Arial"/>
-                <w:b/>
-                <w:i w:val="0"/>
-                <w:color w:val="0D2145"/>
-                <w:sz w:val="17"/>
-              </w:rPr>
-              <w:t>Pelatih</w:t>
-            </w:r>
-          </w:p>
-        </w:tc>
-        <w:tc>
-          <w:tcPr>
-            <w:tcW w:type="dxa" w:w="7517"/>
-            <w:shd w:val="clear" w:color="auto" w:fill="F4F6FA"/>
-            <w:tcBorders>
-              <w:bottom w:val="single" w:sz="6" w:color="FFFFFF"/>
-            </w:tcBorders>
-          </w:tcPr>
-          <w:p>
-            <w:pPr>
-              <w:spacing w:after="0"/>
-            </w:pPr>
-            <w:r>
-              <w:rPr>
-                <w:rFonts w:ascii="Arial" w:hAnsi="Arial"/>
-                <w:b w:val="0"/>
-                <w:i w:val="0"/>
-                <w:color w:val="0B1B36"/>
-                <w:sz w:val="17"/>
-              </w:rPr>
-              <w:t>Coach Iwan</w:t>
-            </w:r>
-          </w:p>
-        </w:tc>
-      </w:tr>
-      <w:tr>
-        <w:tc>
-          <w:tcPr>
-            <w:tcW w:type="dxa" w:w="2120"/>
+            <w:tcW w:type="dxa" w:w="2313"/>
             <w:shd w:val="clear" w:color="auto" w:fill="F4F6FA"/>
             <w:tcBorders>
               <w:bottom w:val="single" w:sz="6" w:color="FFFFFF"/>
@@ -1817,7 +2005,7 @@
         </w:tc>
         <w:tc>
           <w:tcPr>
-            <w:tcW w:type="dxa" w:w="7517"/>
+            <w:tcW w:type="dxa" w:w="7325"/>
             <w:shd w:val="clear" w:color="auto" w:fill="F4F6FA"/>
             <w:tcBorders>
               <w:bottom w:val="single" w:sz="6" w:color="FFFFFF"/>
@@ -1835,7 +2023,7 @@
                 <w:color w:val="0B1B36"/>
                 <w:sz w:val="17"/>
               </w:rPr>
-              <w:t>Sesi akhir pekan dengan format kelas plus kumpul. Sumber: poster Instagram @gowtennis.</w:t>
+              <w:t>Kelas termurah dan berkuota paling besar, titik masuk paling ringan untuk pemula.</w:t>
             </w:r>
           </w:p>
         </w:tc>
@@ -1849,8 +2037,8 @@
     </w:p>
     <w:tbl>
       <w:tblGrid>
-        <w:gridCol w:w="2120"/>
-        <w:gridCol w:w="7517"/>
+        <w:gridCol w:w="2313"/>
+        <w:gridCol w:w="7325"/>
       </w:tblGrid>
       <w:tblPr>
         <w:tblW w:type="auto" w:w="0"/>
@@ -1861,7 +2049,7 @@
       <w:tr>
         <w:tc>
           <w:tcPr>
-            <w:tcW w:type="dxa" w:w="7517"/>
+            <w:tcW w:type="dxa" w:w="7325"/>
             <w:gridSpan w:val="2"/>
             <w:shd w:val="clear" w:color="auto" w:fill="0D2145"/>
           </w:tcPr>
@@ -1877,7 +2065,7 @@
                 <w:color w:val="FFFFFF"/>
                 <w:sz w:val="16"/>
               </w:rPr>
-              <w:t>FUN MATCH</w:t>
+              <w:t>FUN GAMES</w:t>
             </w:r>
           </w:p>
         </w:tc>
@@ -1885,7 +2073,7 @@
       <w:tr>
         <w:tc>
           <w:tcPr>
-            <w:tcW w:type="dxa" w:w="2120"/>
+            <w:tcW w:type="dxa" w:w="2313"/>
             <w:shd w:val="clear" w:color="auto" w:fill="F4F6FA"/>
             <w:tcBorders>
               <w:bottom w:val="single" w:sz="6" w:color="FFFFFF"/>
@@ -1909,7 +2097,7 @@
         </w:tc>
         <w:tc>
           <w:tcPr>
-            <w:tcW w:type="dxa" w:w="7517"/>
+            <w:tcW w:type="dxa" w:w="7325"/>
             <w:shd w:val="clear" w:color="auto" w:fill="F4F6FA"/>
             <w:tcBorders>
               <w:bottom w:val="single" w:sz="6" w:color="FFFFFF"/>
@@ -1927,7 +2115,7 @@
                 <w:color w:val="0B1B36"/>
                 <w:sz w:val="17"/>
               </w:rPr>
-              <w:t>Pertandingan santai antar anggota</w:t>
+              <w:t>—</w:t>
             </w:r>
           </w:p>
         </w:tc>
@@ -1935,7 +2123,7 @@
       <w:tr>
         <w:tc>
           <w:tcPr>
-            <w:tcW w:type="dxa" w:w="2120"/>
+            <w:tcW w:type="dxa" w:w="2313"/>
             <w:shd w:val="clear" w:color="auto" w:fill="F4F6FA"/>
             <w:tcBorders>
               <w:bottom w:val="single" w:sz="6" w:color="FFFFFF"/>
@@ -1959,7 +2147,7 @@
         </w:tc>
         <w:tc>
           <w:tcPr>
-            <w:tcW w:type="dxa" w:w="7517"/>
+            <w:tcW w:type="dxa" w:w="7325"/>
             <w:shd w:val="clear" w:color="auto" w:fill="F4F6FA"/>
             <w:tcBorders>
               <w:bottom w:val="single" w:sz="6" w:color="FFFFFF"/>
@@ -1977,7 +2165,349 @@
                 <w:color w:val="0B1B36"/>
                 <w:sz w:val="17"/>
               </w:rPr>
-              <w:t>Disebut sebagai salah satu dari dua layanan utama di bio Instagram.</w:t>
+              <w:t>Sesi bermain santai akhir pekan. Poster tidak merinci perlengkapan yang termasuk.</w:t>
+            </w:r>
+          </w:p>
+        </w:tc>
+      </w:tr>
+    </w:tbl>
+    <w:p>
+      <w:pPr>
+        <w:spacing w:before="0" w:after="160" w:line="283" w:lineRule="auto"/>
+        <w:jc w:val="left"/>
+      </w:pPr>
+    </w:p>
+    <w:tbl>
+      <w:tblGrid>
+        <w:gridCol w:w="2313"/>
+        <w:gridCol w:w="7325"/>
+      </w:tblGrid>
+      <w:tblPr>
+        <w:tblW w:type="auto" w:w="0"/>
+        <w:jc w:val="left"/>
+        <w:tblLayout w:type="fixed"/>
+        <w:tblLook w:firstColumn="1" w:firstRow="1" w:lastColumn="0" w:lastRow="0" w:noHBand="0" w:noVBand="1" w:val="04A0"/>
+      </w:tblPr>
+      <w:tr>
+        <w:tc>
+          <w:tcPr>
+            <w:tcW w:type="dxa" w:w="7325"/>
+            <w:gridSpan w:val="2"/>
+            <w:shd w:val="clear" w:color="auto" w:fill="0D2145"/>
+          </w:tcPr>
+          <w:p>
+            <w:pPr>
+              <w:spacing w:after="0"/>
+            </w:pPr>
+            <w:r>
+              <w:rPr>
+                <w:rFonts w:ascii="Arial" w:hAnsi="Arial"/>
+                <w:b/>
+                <w:i w:val="0"/>
+                <w:color w:val="FFFFFF"/>
+                <w:sz w:val="16"/>
+              </w:rPr>
+              <w:t>PRIVATE</w:t>
+            </w:r>
+          </w:p>
+        </w:tc>
+      </w:tr>
+      <w:tr>
+        <w:tc>
+          <w:tcPr>
+            <w:tcW w:type="dxa" w:w="2313"/>
+            <w:shd w:val="clear" w:color="auto" w:fill="F4F6FA"/>
+            <w:tcBorders>
+              <w:bottom w:val="single" w:sz="6" w:color="FFFFFF"/>
+            </w:tcBorders>
+          </w:tcPr>
+          <w:p>
+            <w:pPr>
+              <w:spacing w:after="0"/>
+            </w:pPr>
+            <w:r>
+              <w:rPr>
+                <w:rFonts w:ascii="Arial" w:hAnsi="Arial"/>
+                <w:b/>
+                <w:i w:val="0"/>
+                <w:color w:val="0D2145"/>
+                <w:sz w:val="17"/>
+              </w:rPr>
+              <w:t>Termasuk</w:t>
+            </w:r>
+          </w:p>
+        </w:tc>
+        <w:tc>
+          <w:tcPr>
+            <w:tcW w:type="dxa" w:w="7325"/>
+            <w:shd w:val="clear" w:color="auto" w:fill="F4F6FA"/>
+            <w:tcBorders>
+              <w:bottom w:val="single" w:sz="6" w:color="FFFFFF"/>
+            </w:tcBorders>
+          </w:tcPr>
+          <w:p>
+            <w:pPr>
+              <w:spacing w:after="0"/>
+            </w:pPr>
+            <w:r>
+              <w:rPr>
+                <w:rFonts w:ascii="Arial" w:hAnsi="Arial"/>
+                <w:b w:val="0"/>
+                <w:i w:val="0"/>
+                <w:color w:val="0B1B36"/>
+                <w:sz w:val="17"/>
+              </w:rPr>
+              <w:t>Ballboy</w:t>
+            </w:r>
+          </w:p>
+        </w:tc>
+      </w:tr>
+      <w:tr>
+        <w:tc>
+          <w:tcPr>
+            <w:tcW w:type="dxa" w:w="2313"/>
+            <w:shd w:val="clear" w:color="auto" w:fill="F4F6FA"/>
+            <w:tcBorders>
+              <w:bottom w:val="single" w:sz="6" w:color="FFFFFF"/>
+            </w:tcBorders>
+          </w:tcPr>
+          <w:p>
+            <w:pPr>
+              <w:spacing w:after="0"/>
+            </w:pPr>
+            <w:r>
+              <w:rPr>
+                <w:rFonts w:ascii="Arial" w:hAnsi="Arial"/>
+                <w:b/>
+                <w:i w:val="0"/>
+                <w:color w:val="0D2145"/>
+                <w:sz w:val="17"/>
+              </w:rPr>
+              <w:t>Belum termasuk</w:t>
+            </w:r>
+          </w:p>
+        </w:tc>
+        <w:tc>
+          <w:tcPr>
+            <w:tcW w:type="dxa" w:w="7325"/>
+            <w:shd w:val="clear" w:color="auto" w:fill="F4F6FA"/>
+            <w:tcBorders>
+              <w:bottom w:val="single" w:sz="6" w:color="FFFFFF"/>
+            </w:tcBorders>
+          </w:tcPr>
+          <w:p>
+            <w:pPr>
+              <w:spacing w:after="0"/>
+            </w:pPr>
+            <w:r>
+              <w:rPr>
+                <w:rFonts w:ascii="Arial" w:hAnsi="Arial"/>
+                <w:b w:val="0"/>
+                <w:i w:val="0"/>
+                <w:color w:val="0B1B36"/>
+                <w:sz w:val="17"/>
+              </w:rPr>
+              <w:t>Sewa lapangan</w:t>
+            </w:r>
+          </w:p>
+        </w:tc>
+      </w:tr>
+      <w:tr>
+        <w:tc>
+          <w:tcPr>
+            <w:tcW w:type="dxa" w:w="2313"/>
+            <w:shd w:val="clear" w:color="auto" w:fill="F4F6FA"/>
+            <w:tcBorders>
+              <w:bottom w:val="single" w:sz="6" w:color="FFFFFF"/>
+            </w:tcBorders>
+          </w:tcPr>
+          <w:p>
+            <w:pPr>
+              <w:spacing w:after="0"/>
+            </w:pPr>
+            <w:r>
+              <w:rPr>
+                <w:rFonts w:ascii="Arial" w:hAnsi="Arial"/>
+                <w:b/>
+                <w:i w:val="0"/>
+                <w:color w:val="0D2145"/>
+                <w:sz w:val="17"/>
+              </w:rPr>
+              <w:t>Lapangan Abadi</w:t>
+            </w:r>
+          </w:p>
+        </w:tc>
+        <w:tc>
+          <w:tcPr>
+            <w:tcW w:type="dxa" w:w="7325"/>
+            <w:shd w:val="clear" w:color="auto" w:fill="F4F6FA"/>
+            <w:tcBorders>
+              <w:bottom w:val="single" w:sz="6" w:color="FFFFFF"/>
+            </w:tcBorders>
+          </w:tcPr>
+          <w:p>
+            <w:pPr>
+              <w:spacing w:after="0"/>
+            </w:pPr>
+            <w:r>
+              <w:rPr>
+                <w:rFonts w:ascii="Arial" w:hAnsi="Arial"/>
+                <w:b w:val="0"/>
+                <w:i w:val="0"/>
+                <w:color w:val="0B1B36"/>
+                <w:sz w:val="17"/>
+              </w:rPr>
+              <w:t>sewa Rp240.000 + coaching Rp330.000 = Rp570.000 per sesi 2 jam</w:t>
+            </w:r>
+          </w:p>
+        </w:tc>
+      </w:tr>
+      <w:tr>
+        <w:tc>
+          <w:tcPr>
+            <w:tcW w:type="dxa" w:w="2313"/>
+            <w:shd w:val="clear" w:color="auto" w:fill="F4F6FA"/>
+            <w:tcBorders>
+              <w:bottom w:val="single" w:sz="6" w:color="FFFFFF"/>
+            </w:tcBorders>
+          </w:tcPr>
+          <w:p>
+            <w:pPr>
+              <w:spacing w:after="0"/>
+            </w:pPr>
+            <w:r>
+              <w:rPr>
+                <w:rFonts w:ascii="Arial" w:hAnsi="Arial"/>
+                <w:b/>
+                <w:i w:val="0"/>
+                <w:color w:val="0D2145"/>
+                <w:sz w:val="17"/>
+              </w:rPr>
+              <w:t>Lapangan Secapa</w:t>
+            </w:r>
+          </w:p>
+        </w:tc>
+        <w:tc>
+          <w:tcPr>
+            <w:tcW w:type="dxa" w:w="7325"/>
+            <w:shd w:val="clear" w:color="auto" w:fill="F4F6FA"/>
+            <w:tcBorders>
+              <w:bottom w:val="single" w:sz="6" w:color="FFFFFF"/>
+            </w:tcBorders>
+          </w:tcPr>
+          <w:p>
+            <w:pPr>
+              <w:spacing w:after="0"/>
+            </w:pPr>
+            <w:r>
+              <w:rPr>
+                <w:rFonts w:ascii="Arial" w:hAnsi="Arial"/>
+                <w:b w:val="0"/>
+                <w:i w:val="0"/>
+                <w:color w:val="0B1B36"/>
+                <w:sz w:val="17"/>
+              </w:rPr>
+              <w:t>sewa Rp250.000 + coaching Rp330.000 = Rp580.000 per sesi 2 jam</w:t>
+            </w:r>
+          </w:p>
+        </w:tc>
+      </w:tr>
+      <w:tr>
+        <w:tc>
+          <w:tcPr>
+            <w:tcW w:type="dxa" w:w="2313"/>
+            <w:shd w:val="clear" w:color="auto" w:fill="F4F6FA"/>
+            <w:tcBorders>
+              <w:bottom w:val="single" w:sz="6" w:color="FFFFFF"/>
+            </w:tcBorders>
+          </w:tcPr>
+          <w:p>
+            <w:pPr>
+              <w:spacing w:after="0"/>
+            </w:pPr>
+            <w:r>
+              <w:rPr>
+                <w:rFonts w:ascii="Arial" w:hAnsi="Arial"/>
+                <w:b/>
+                <w:i w:val="0"/>
+                <w:color w:val="0D2145"/>
+                <w:sz w:val="17"/>
+              </w:rPr>
+              <w:t>Fotografer</w:t>
+            </w:r>
+          </w:p>
+        </w:tc>
+        <w:tc>
+          <w:tcPr>
+            <w:tcW w:type="dxa" w:w="7325"/>
+            <w:shd w:val="clear" w:color="auto" w:fill="F4F6FA"/>
+            <w:tcBorders>
+              <w:bottom w:val="single" w:sz="6" w:color="FFFFFF"/>
+            </w:tcBorders>
+          </w:tcPr>
+          <w:p>
+            <w:pPr>
+              <w:spacing w:after="0"/>
+            </w:pPr>
+            <w:r>
+              <w:rPr>
+                <w:rFonts w:ascii="Arial" w:hAnsi="Arial"/>
+                <w:b w:val="0"/>
+                <w:i w:val="0"/>
+                <w:color w:val="0B1B36"/>
+                <w:sz w:val="17"/>
+              </w:rPr>
+              <w:t>Rp100.000 (by request)</w:t>
+            </w:r>
+          </w:p>
+        </w:tc>
+      </w:tr>
+      <w:tr>
+        <w:tc>
+          <w:tcPr>
+            <w:tcW w:type="dxa" w:w="2313"/>
+            <w:shd w:val="clear" w:color="auto" w:fill="F4F6FA"/>
+            <w:tcBorders>
+              <w:bottom w:val="single" w:sz="6" w:color="FFFFFF"/>
+            </w:tcBorders>
+          </w:tcPr>
+          <w:p>
+            <w:pPr>
+              <w:spacing w:after="0"/>
+            </w:pPr>
+            <w:r>
+              <w:rPr>
+                <w:rFonts w:ascii="Arial" w:hAnsi="Arial"/>
+                <w:b/>
+                <w:i w:val="0"/>
+                <w:color w:val="0D2145"/>
+                <w:sz w:val="17"/>
+              </w:rPr>
+              <w:t>Catatan</w:t>
+            </w:r>
+          </w:p>
+        </w:tc>
+        <w:tc>
+          <w:tcPr>
+            <w:tcW w:type="dxa" w:w="7325"/>
+            <w:shd w:val="clear" w:color="auto" w:fill="F4F6FA"/>
+            <w:tcBorders>
+              <w:bottom w:val="single" w:sz="6" w:color="FFFFFF"/>
+            </w:tcBorders>
+          </w:tcPr>
+          <w:p>
+            <w:pPr>
+              <w:spacing w:after="0"/>
+            </w:pPr>
+            <w:r>
+              <w:rPr>
+                <w:rFonts w:ascii="Arial" w:hAnsi="Arial"/>
+                <w:b w:val="0"/>
+                <w:i w:val="0"/>
+                <w:color w:val="0B1B36"/>
+                <w:sz w:val="17"/>
+              </w:rPr>
+              <w:t>Tarif coaching Rp165.000 per jam setara Rp330.000 untuk satu sesi 2 jam, dan sewa lapangan dihitung terpisah. Sumber: poster Private Class.</w:t>
             </w:r>
           </w:p>
         </w:tc>
@@ -2226,7 +2756,7 @@
                 <w:color w:val="0B1B36"/>
                 <w:sz w:val="17"/>
               </w:rPr>
-              <w:t>Coaching session reguler</w:t>
+              <w:t>Semi-Intense (Senin)</w:t>
             </w:r>
           </w:p>
         </w:tc>
@@ -2252,7 +2782,7 @@
                 <w:color w:val="0D2145"/>
                 <w:sz w:val="17"/>
               </w:rPr>
-              <w:t>Lapangan Outdoor Pusdikku</w:t>
+              <w:t>Lapangan Outdoor UPI</w:t>
             </w:r>
           </w:p>
         </w:tc>
@@ -2324,7 +2854,293 @@
                 <w:color w:val="0B1B36"/>
                 <w:sz w:val="17"/>
               </w:rPr>
-              <w:t>Tennis Malam Minggu</w:t>
+              <w:t>Coaching Beginner (Selasa)</w:t>
+            </w:r>
+          </w:p>
+        </w:tc>
+      </w:tr>
+      <w:tr>
+        <w:tc>
+          <w:tcPr>
+            <w:tcW w:type="dxa" w:w="3180"/>
+            <w:tcBorders>
+              <w:bottom w:val="single" w:sz="4" w:color="E2E8F0"/>
+            </w:tcBorders>
+          </w:tcPr>
+          <w:p>
+            <w:pPr>
+              <w:spacing w:after="0"/>
+            </w:pPr>
+            <w:r>
+              <w:rPr>
+                <w:rFonts w:ascii="Arial" w:hAnsi="Arial"/>
+                <w:b/>
+                <w:i w:val="0"/>
+                <w:color w:val="0D2145"/>
+                <w:sz w:val="17"/>
+              </w:rPr>
+              <w:t>Lapangan Tennis PRV</w:t>
+            </w:r>
+          </w:p>
+        </w:tc>
+        <w:tc>
+          <w:tcPr>
+            <w:tcW w:type="dxa" w:w="1349"/>
+            <w:tcBorders>
+              <w:bottom w:val="single" w:sz="4" w:color="E2E8F0"/>
+            </w:tcBorders>
+          </w:tcPr>
+          <w:p>
+            <w:pPr>
+              <w:spacing w:after="0"/>
+            </w:pPr>
+            <w:r>
+              <w:rPr>
+                <w:rFonts w:ascii="Arial" w:hAnsi="Arial"/>
+                <w:b w:val="0"/>
+                <w:i w:val="0"/>
+                <w:color w:val="0B1B36"/>
+                <w:sz w:val="17"/>
+              </w:rPr>
+              <w:t>—</w:t>
+            </w:r>
+          </w:p>
+        </w:tc>
+        <w:tc>
+          <w:tcPr>
+            <w:tcW w:type="dxa" w:w="1446"/>
+            <w:tcBorders>
+              <w:bottom w:val="single" w:sz="4" w:color="E2E8F0"/>
+            </w:tcBorders>
+          </w:tcPr>
+          <w:p>
+            <w:pPr>
+              <w:spacing w:after="0"/>
+            </w:pPr>
+            <w:r>
+              <w:rPr>
+                <w:rFonts w:ascii="Arial" w:hAnsi="Arial"/>
+                <w:b w:val="0"/>
+                <w:i w:val="0"/>
+                <w:color w:val="0B1B36"/>
+                <w:sz w:val="17"/>
+              </w:rPr>
+              <w:t>Bandung</w:t>
+            </w:r>
+          </w:p>
+        </w:tc>
+        <w:tc>
+          <w:tcPr>
+            <w:tcW w:type="dxa" w:w="3662"/>
+            <w:tcBorders>
+              <w:bottom w:val="single" w:sz="4" w:color="E2E8F0"/>
+            </w:tcBorders>
+          </w:tcPr>
+          <w:p>
+            <w:pPr>
+              <w:spacing w:after="0"/>
+            </w:pPr>
+            <w:r>
+              <w:rPr>
+                <w:rFonts w:ascii="Arial" w:hAnsi="Arial"/>
+                <w:b w:val="0"/>
+                <w:i w:val="0"/>
+                <w:color w:val="0B1B36"/>
+                <w:sz w:val="17"/>
+              </w:rPr>
+              <w:t>Fun Games (Sabtu)</w:t>
+            </w:r>
+          </w:p>
+        </w:tc>
+      </w:tr>
+      <w:tr>
+        <w:tc>
+          <w:tcPr>
+            <w:tcW w:type="dxa" w:w="3180"/>
+            <w:shd w:val="clear" w:color="auto" w:fill="F4F6FA"/>
+            <w:tcBorders>
+              <w:bottom w:val="single" w:sz="4" w:color="E2E8F0"/>
+            </w:tcBorders>
+          </w:tcPr>
+          <w:p>
+            <w:pPr>
+              <w:spacing w:after="0"/>
+            </w:pPr>
+            <w:r>
+              <w:rPr>
+                <w:rFonts w:ascii="Arial" w:hAnsi="Arial"/>
+                <w:b/>
+                <w:i w:val="0"/>
+                <w:color w:val="0D2145"/>
+                <w:sz w:val="17"/>
+              </w:rPr>
+              <w:t>Lapangan Abadi</w:t>
+            </w:r>
+          </w:p>
+        </w:tc>
+        <w:tc>
+          <w:tcPr>
+            <w:tcW w:type="dxa" w:w="1349"/>
+            <w:shd w:val="clear" w:color="auto" w:fill="F4F6FA"/>
+            <w:tcBorders>
+              <w:bottom w:val="single" w:sz="4" w:color="E2E8F0"/>
+            </w:tcBorders>
+          </w:tcPr>
+          <w:p>
+            <w:pPr>
+              <w:spacing w:after="0"/>
+            </w:pPr>
+            <w:r>
+              <w:rPr>
+                <w:rFonts w:ascii="Arial" w:hAnsi="Arial"/>
+                <w:b w:val="0"/>
+                <w:i w:val="0"/>
+                <w:color w:val="0B1B36"/>
+                <w:sz w:val="17"/>
+              </w:rPr>
+              <w:t>—</w:t>
+            </w:r>
+          </w:p>
+        </w:tc>
+        <w:tc>
+          <w:tcPr>
+            <w:tcW w:type="dxa" w:w="1446"/>
+            <w:shd w:val="clear" w:color="auto" w:fill="F4F6FA"/>
+            <w:tcBorders>
+              <w:bottom w:val="single" w:sz="4" w:color="E2E8F0"/>
+            </w:tcBorders>
+          </w:tcPr>
+          <w:p>
+            <w:pPr>
+              <w:spacing w:after="0"/>
+            </w:pPr>
+            <w:r>
+              <w:rPr>
+                <w:rFonts w:ascii="Arial" w:hAnsi="Arial"/>
+                <w:b w:val="0"/>
+                <w:i w:val="0"/>
+                <w:color w:val="0B1B36"/>
+                <w:sz w:val="17"/>
+              </w:rPr>
+              <w:t>Bandung</w:t>
+            </w:r>
+          </w:p>
+        </w:tc>
+        <w:tc>
+          <w:tcPr>
+            <w:tcW w:type="dxa" w:w="3662"/>
+            <w:shd w:val="clear" w:color="auto" w:fill="F4F6FA"/>
+            <w:tcBorders>
+              <w:bottom w:val="single" w:sz="4" w:color="E2E8F0"/>
+            </w:tcBorders>
+          </w:tcPr>
+          <w:p>
+            <w:pPr>
+              <w:spacing w:after="0"/>
+            </w:pPr>
+            <w:r>
+              <w:rPr>
+                <w:rFonts w:ascii="Arial" w:hAnsi="Arial"/>
+                <w:b w:val="0"/>
+                <w:i w:val="0"/>
+                <w:color w:val="0B1B36"/>
+                <w:sz w:val="17"/>
+              </w:rPr>
+              <w:t>Private Class</w:t>
+            </w:r>
+          </w:p>
+        </w:tc>
+      </w:tr>
+      <w:tr>
+        <w:tc>
+          <w:tcPr>
+            <w:tcW w:type="dxa" w:w="3180"/>
+            <w:tcBorders>
+              <w:bottom w:val="single" w:sz="4" w:color="E2E8F0"/>
+            </w:tcBorders>
+          </w:tcPr>
+          <w:p>
+            <w:pPr>
+              <w:spacing w:after="0"/>
+            </w:pPr>
+            <w:r>
+              <w:rPr>
+                <w:rFonts w:ascii="Arial" w:hAnsi="Arial"/>
+                <w:b/>
+                <w:i w:val="0"/>
+                <w:color w:val="0D2145"/>
+                <w:sz w:val="17"/>
+              </w:rPr>
+              <w:t>Lapangan Secapa</w:t>
+            </w:r>
+          </w:p>
+        </w:tc>
+        <w:tc>
+          <w:tcPr>
+            <w:tcW w:type="dxa" w:w="1349"/>
+            <w:tcBorders>
+              <w:bottom w:val="single" w:sz="4" w:color="E2E8F0"/>
+            </w:tcBorders>
+          </w:tcPr>
+          <w:p>
+            <w:pPr>
+              <w:spacing w:after="0"/>
+            </w:pPr>
+            <w:r>
+              <w:rPr>
+                <w:rFonts w:ascii="Arial" w:hAnsi="Arial"/>
+                <w:b w:val="0"/>
+                <w:i w:val="0"/>
+                <w:color w:val="0B1B36"/>
+                <w:sz w:val="17"/>
+              </w:rPr>
+              <w:t>—</w:t>
+            </w:r>
+          </w:p>
+        </w:tc>
+        <w:tc>
+          <w:tcPr>
+            <w:tcW w:type="dxa" w:w="1446"/>
+            <w:tcBorders>
+              <w:bottom w:val="single" w:sz="4" w:color="E2E8F0"/>
+            </w:tcBorders>
+          </w:tcPr>
+          <w:p>
+            <w:pPr>
+              <w:spacing w:after="0"/>
+            </w:pPr>
+            <w:r>
+              <w:rPr>
+                <w:rFonts w:ascii="Arial" w:hAnsi="Arial"/>
+                <w:b w:val="0"/>
+                <w:i w:val="0"/>
+                <w:color w:val="0B1B36"/>
+                <w:sz w:val="17"/>
+              </w:rPr>
+              <w:t>Bandung</w:t>
+            </w:r>
+          </w:p>
+        </w:tc>
+        <w:tc>
+          <w:tcPr>
+            <w:tcW w:type="dxa" w:w="3662"/>
+            <w:tcBorders>
+              <w:bottom w:val="single" w:sz="4" w:color="E2E8F0"/>
+            </w:tcBorders>
+          </w:tcPr>
+          <w:p>
+            <w:pPr>
+              <w:spacing w:after="0"/>
+            </w:pPr>
+            <w:r>
+              <w:rPr>
+                <w:rFonts w:ascii="Arial" w:hAnsi="Arial"/>
+                <w:b w:val="0"/>
+                <w:i w:val="0"/>
+                <w:color w:val="0B1B36"/>
+                <w:sz w:val="17"/>
+              </w:rPr>
+              <w:t>Private Class</w:t>
             </w:r>
           </w:p>
         </w:tc>
@@ -2674,7 +3490,7 @@
           <w:color w:val="0B1B36"/>
           <w:sz w:val="19"/>
         </w:rPr>
-        <w:t>Rekaman latihan dan fun match di lapangan UPI maupun Pusdikku.</w:t>
+        <w:t>Rekaman latihan dan fun games di lapangan UPI dan lapangan mitra lain di Bandung.</w:t>
       </w:r>
     </w:p>
     <w:p>
@@ -2724,7 +3540,7 @@
           <w:color w:val="0B1B36"/>
           <w:sz w:val="19"/>
         </w:rPr>
-        <w:t>Poster jadwal coaching session dan event, dipin di urutan pertama feed Instagram.</w:t>
+        <w:t>Poster jadwal mingguan dan tarif, dipin di urutan pertama feed Instagram.</w:t>
       </w:r>
     </w:p>
     <w:p>
@@ -3110,7 +3926,7 @@
           <w:color w:val="64748B"/>
           <w:sz w:val="16"/>
         </w:rPr>
-        <w:t>Riset profil publik Instagram @gowtennis &amp; TikTok @gowtennis. Angka follower &amp; jumlah post adalah snapshot per tanggal riset. Field bertanda perlu_konfirmasi=true belum terverifikasi dan harus dilengkapi pengelola klub.</w:t>
+        <w:t>Riset profil publik Instagram @gowtennis &amp; TikTok @gowtennis, diperbarui dari poster jadwal resmi klub (25 September 2026). Program, tarif, dan lapangan mengikuti poster jadwal 25 September 2026. Angka follower adalah snapshot 19 September 2026. Field bertanda perlu_konfirmasi belum terverifikasi dan harus dilengkapi pengelola klub.</w:t>
       </w:r>
     </w:p>
     <w:p>
@@ -3126,7 +3942,7 @@
           <w:color w:val="0D2145"/>
           <w:sz w:val="16"/>
         </w:rPr>
-        <w:t>Belum terverifikasi (4 hal):</w:t>
+        <w:t>Belum terverifikasi (8 hal):</w:t>
       </w:r>
     </w:p>
     <w:p>
@@ -3142,7 +3958,7 @@
           <w:color w:val="64748B"/>
           <w:sz w:val="16"/>
         </w:rPr>
-        <w:t>1. Singkatan FG pada caption TikTok belum diketahui artinya.</w:t>
+        <w:t>1. Singkatan FG pada poster jadwal dan caption TikTok belum diketahui artinya.</w:t>
       </w:r>
     </w:p>
     <w:p>
@@ -3158,7 +3974,7 @@
           <w:color w:val="64748B"/>
           <w:sz w:val="16"/>
         </w:rPr>
-        <w:t>2. Tahun berdiri, jumlah anggota aktif, dan struktur pengelola belum tercantum di kanal publik mana pun.</w:t>
+        <w:t>2. Tennis Malam Minggu (Sabtu 18.00-20.00, Rp115.000) dan Lapangan Outdoor Pusdikku tidak lagi muncul di jadwal 25 September 2026, sehingga diasumsikan digantikan Fun Games. Perlu dipastikan apakah benar sudah dihentikan.</w:t>
       </w:r>
     </w:p>
     <w:p>
@@ -3174,7 +3990,7 @@
           <w:color w:val="64748B"/>
           <w:sz w:val="16"/>
         </w:rPr>
-        <w:t>3. Alamat lengkap dan titik peta kedua lapangan belum dipublikasikan.</w:t>
+        <w:t>3. Poster jadwal tidak mencantumkan nama pelatih. Coach Iwan sebelumnya tercatat mengajar Tennis Malam Minggu yang kini tidak ada di jadwal.</w:t>
       </w:r>
     </w:p>
     <w:p>
@@ -3190,7 +4006,71 @@
           <w:color w:val="64748B"/>
           <w:sz w:val="16"/>
         </w:rPr>
-        <w:t>4. URL tiga video TikTok belum tersedia karena TikTok tidak mengekspos daftar video ke pengunjung anonim.</w:t>
+        <w:t>4. Tipe lapangan (indoor atau outdoor) untuk PRV, Abadi, dan Secapa belum disebutkan.</w:t>
+      </w:r>
+    </w:p>
+    <w:p>
+      <w:pPr>
+        <w:spacing w:after="60"/>
+        <w:ind w:left="283"/>
+      </w:pPr>
+      <w:r>
+        <w:rPr>
+          <w:rFonts w:ascii="Arial" w:hAnsi="Arial"/>
+          <w:b w:val="0"/>
+          <w:i w:val="0"/>
+          <w:color w:val="64748B"/>
+          <w:sz w:val="16"/>
+        </w:rPr>
+        <w:t>5. Tingkat kemampuan untuk Semi-Intense dan Fun Games tidak dicantumkan di poster.</w:t>
+      </w:r>
+    </w:p>
+    <w:p>
+      <w:pPr>
+        <w:spacing w:after="60"/>
+        <w:ind w:left="283"/>
+      </w:pPr>
+      <w:r>
+        <w:rPr>
+          <w:rFonts w:ascii="Arial" w:hAnsi="Arial"/>
+          <w:b w:val="0"/>
+          <w:i w:val="0"/>
+          <w:color w:val="64748B"/>
+          <w:sz w:val="16"/>
+        </w:rPr>
+        <w:t>6. Tahun berdiri, jumlah anggota aktif, dan struktur pengelola belum tercantum di kanal publik mana pun.</w:t>
+      </w:r>
+    </w:p>
+    <w:p>
+      <w:pPr>
+        <w:spacing w:after="60"/>
+        <w:ind w:left="283"/>
+      </w:pPr>
+      <w:r>
+        <w:rPr>
+          <w:rFonts w:ascii="Arial" w:hAnsi="Arial"/>
+          <w:b w:val="0"/>
+          <w:i w:val="0"/>
+          <w:color w:val="64748B"/>
+          <w:sz w:val="16"/>
+        </w:rPr>
+        <w:t>7. Alamat lengkap dan titik peta kelima lapangan belum dipublikasikan.</w:t>
+      </w:r>
+    </w:p>
+    <w:p>
+      <w:pPr>
+        <w:spacing w:after="60"/>
+        <w:ind w:left="283"/>
+      </w:pPr>
+      <w:r>
+        <w:rPr>
+          <w:rFonts w:ascii="Arial" w:hAnsi="Arial"/>
+          <w:b w:val="0"/>
+          <w:i w:val="0"/>
+          <w:color w:val="64748B"/>
+          <w:sz w:val="16"/>
+        </w:rPr>
+        <w:t>8. URL tiga video TikTok belum tersedia karena TikTok tidak mengekspos daftar video ke pengunjung anonim.</w:t>
       </w:r>
     </w:p>
     <w:sectPr>

</xml_diff>